<commit_message>
Update databse for id_user random
</commit_message>
<xml_diff>
--- a/Pretest_Postest_Ciencia_Viva.docx
+++ b/Pretest_Postest_Ciencia_Viva.docx
@@ -70,12 +70,6 @@
         <w:gridCol w:w="5040"/>
       </w:tblGrid>
       <w:tr>
-        <w:tblPrEx>
-          <w:tblCellMar>
-            <w:top w:w="0" w:type="dxa"/>
-            <w:bottom w:w="0" w:type="dxa"/>
-          </w:tblCellMar>
-        </w:tblPrEx>
         <w:trPr>
           <w:jc w:val="center"/>
         </w:trPr>
@@ -108,13 +102,8 @@
               <w:t xml:space="preserve">Tipo de prueba:   </w:t>
             </w:r>
             <w:r>
-              <w:t xml:space="preserve">☐ Pretest     ☐ </w:t>
-            </w:r>
-            <w:proofErr w:type="spellStart"/>
-            <w:r>
-              <w:t>Postest</w:t>
-            </w:r>
-            <w:proofErr w:type="spellEnd"/>
+              <w:t>☐ Pretest     ☐ Postest</w:t>
+            </w:r>
           </w:p>
         </w:tc>
         <w:tc>
@@ -156,12 +145,6 @@
         </w:tc>
       </w:tr>
       <w:tr>
-        <w:tblPrEx>
-          <w:tblCellMar>
-            <w:top w:w="0" w:type="dxa"/>
-            <w:bottom w:w="0" w:type="dxa"/>
-          </w:tblCellMar>
-        </w:tblPrEx>
         <w:trPr>
           <w:jc w:val="center"/>
         </w:trPr>
@@ -204,12 +187,6 @@
         </w:tc>
       </w:tr>
       <w:tr>
-        <w:tblPrEx>
-          <w:tblCellMar>
-            <w:top w:w="0" w:type="dxa"/>
-            <w:bottom w:w="0" w:type="dxa"/>
-          </w:tblCellMar>
-        </w:tblPrEx>
         <w:trPr>
           <w:jc w:val="center"/>
         </w:trPr>
@@ -287,12 +264,6 @@
         </w:tc>
       </w:tr>
       <w:tr>
-        <w:tblPrEx>
-          <w:tblCellMar>
-            <w:top w:w="0" w:type="dxa"/>
-            <w:bottom w:w="0" w:type="dxa"/>
-          </w:tblCellMar>
-        </w:tblPrEx>
         <w:trPr>
           <w:jc w:val="center"/>
         </w:trPr>
@@ -2555,107 +2526,56 @@
         <w:t>Observa los alimentos. ¿Cuál tiene mucha azúcar y se debe consumir poco?</w:t>
       </w:r>
     </w:p>
-    <w:tbl>
-      <w:tblPr>
-        <w:tblW w:w="8640" w:type="dxa"/>
-        <w:jc w:val="center"/>
-        <w:tblBorders>
-          <w:top w:val="single" w:sz="4" w:space="0" w:color="auto"/>
-          <w:left w:val="single" w:sz="4" w:space="0" w:color="auto"/>
-          <w:bottom w:val="single" w:sz="4" w:space="0" w:color="auto"/>
-          <w:right w:val="single" w:sz="4" w:space="0" w:color="auto"/>
-          <w:insideH w:val="single" w:sz="4" w:space="0" w:color="auto"/>
-          <w:insideV w:val="single" w:sz="4" w:space="0" w:color="auto"/>
-        </w:tblBorders>
-        <w:tblCellMar>
-          <w:left w:w="10" w:type="dxa"/>
-          <w:right w:w="10" w:type="dxa"/>
-        </w:tblCellMar>
-        <w:tblLook w:val="04A0" w:firstRow="1" w:lastRow="0" w:firstColumn="1" w:lastColumn="0" w:noHBand="0" w:noVBand="1"/>
-      </w:tblPr>
-      <w:tblGrid>
-        <w:gridCol w:w="8640"/>
-      </w:tblGrid>
-      <w:tr>
-        <w:tblPrEx>
-          <w:tblCellMar>
-            <w:top w:w="0" w:type="dxa"/>
-            <w:bottom w:w="0" w:type="dxa"/>
-          </w:tblCellMar>
-        </w:tblPrEx>
-        <w:trPr>
-          <w:cantSplit/>
-          <w:trHeight w:val="3200"/>
-          <w:jc w:val="center"/>
-        </w:trPr>
-        <w:tc>
-          <w:tcPr>
-            <w:tcW w:w="8640" w:type="dxa"/>
-            <w:tcBorders>
-              <w:top w:val="dashed" w:sz="12" w:space="0" w:color="1F6F5C"/>
-              <w:left w:val="dashed" w:sz="12" w:space="0" w:color="1F6F5C"/>
-              <w:bottom w:val="dashed" w:sz="12" w:space="0" w:color="1F6F5C"/>
-              <w:right w:val="dashed" w:sz="12" w:space="0" w:color="1F6F5C"/>
-            </w:tcBorders>
-            <w:shd w:val="clear" w:color="auto" w:fill="F7FBF9"/>
-            <w:tcMar>
-              <w:top w:w="80" w:type="dxa"/>
-              <w:left w:w="120" w:type="dxa"/>
-              <w:bottom w:w="80" w:type="dxa"/>
-              <w:right w:w="120" w:type="dxa"/>
-            </w:tcMar>
-            <w:vAlign w:val="center"/>
-          </w:tcPr>
-          <w:p>
-            <w:pPr>
-              <w:spacing w:after="80"/>
-              <w:jc w:val="center"/>
-            </w:pPr>
-            <w:r>
-              <w:rPr>
-                <w:b/>
-                <w:bCs/>
-                <w:color w:val="1F6F5C"/>
-                <w:sz w:val="22"/>
-                <w:szCs w:val="22"/>
-              </w:rPr>
-              <w:t xml:space="preserve">[ ESPACIO PARA </w:t>
-            </w:r>
-            <w:proofErr w:type="gramStart"/>
-            <w:r>
-              <w:rPr>
-                <w:b/>
-                <w:bCs/>
-                <w:color w:val="1F6F5C"/>
-                <w:sz w:val="22"/>
-                <w:szCs w:val="22"/>
-              </w:rPr>
-              <w:t>IMAGEN ]</w:t>
-            </w:r>
-            <w:proofErr w:type="gramEnd"/>
-          </w:p>
-          <w:p>
-            <w:pPr>
-              <w:jc w:val="center"/>
-            </w:pPr>
-            <w:r>
-              <w:rPr>
-                <w:i/>
-                <w:iCs/>
-                <w:color w:val="5A5A5A"/>
-                <w:sz w:val="20"/>
-                <w:szCs w:val="20"/>
-              </w:rPr>
-              <w:t>Descripción sugerida: Cuatro alimentos marcados con letras: A) un vaso de agua, B) una lechuga, C) una gaseosa, D) una fruta.</w:t>
-            </w:r>
-          </w:p>
-        </w:tc>
-      </w:tr>
-    </w:tbl>
     <w:p>
       <w:pPr>
         <w:spacing w:after="60"/>
       </w:pPr>
+      <w:r>
+        <w:rPr>
+          <w:noProof/>
+        </w:rPr>
+        <w:drawing>
+          <wp:inline distT="0" distB="0" distL="0" distR="0" wp14:anchorId="257B7111" wp14:editId="34A34294">
+            <wp:extent cx="3240000" cy="2160000"/>
+            <wp:effectExtent l="0" t="0" r="0" b="0"/>
+            <wp:docPr id="2113296400" name="Imagen 1"/>
+            <wp:cNvGraphicFramePr>
+              <a:graphicFrameLocks xmlns:a="http://schemas.openxmlformats.org/drawingml/2006/main" noChangeAspect="1"/>
+            </wp:cNvGraphicFramePr>
+            <a:graphic xmlns:a="http://schemas.openxmlformats.org/drawingml/2006/main">
+              <a:graphicData uri="http://schemas.openxmlformats.org/drawingml/2006/picture">
+                <pic:pic xmlns:pic="http://schemas.openxmlformats.org/drawingml/2006/picture">
+                  <pic:nvPicPr>
+                    <pic:cNvPr id="2113296400" name="Imagen 2113296400"/>
+                    <pic:cNvPicPr/>
+                  </pic:nvPicPr>
+                  <pic:blipFill>
+                    <a:blip r:embed="rId12" cstate="print">
+                      <a:extLst>
+                        <a:ext uri="{28A0092B-C50C-407E-A947-70E740481C1C}">
+                          <a14:useLocalDpi xmlns:a14="http://schemas.microsoft.com/office/drawing/2010/main" val="0"/>
+                        </a:ext>
+                      </a:extLst>
+                    </a:blip>
+                    <a:stretch>
+                      <a:fillRect/>
+                    </a:stretch>
+                  </pic:blipFill>
+                  <pic:spPr>
+                    <a:xfrm>
+                      <a:off x="0" y="0"/>
+                      <a:ext cx="3240000" cy="2160000"/>
+                    </a:xfrm>
+                    <a:prstGeom prst="rect">
+                      <a:avLst/>
+                    </a:prstGeom>
+                  </pic:spPr>
+                </pic:pic>
+              </a:graphicData>
+            </a:graphic>
+          </wp:inline>
+        </w:drawing>
+      </w:r>
     </w:p>
     <w:p>
       <w:pPr>
@@ -2810,12 +2730,6 @@
         <w:gridCol w:w="900"/>
       </w:tblGrid>
       <w:tr>
-        <w:tblPrEx>
-          <w:tblCellMar>
-            <w:top w:w="0" w:type="dxa"/>
-            <w:bottom w:w="0" w:type="dxa"/>
-          </w:tblCellMar>
-        </w:tblPrEx>
         <w:trPr>
           <w:tblHeader/>
           <w:jc w:val="center"/>
@@ -2842,7 +2756,6 @@
             <w:pPr>
               <w:jc w:val="center"/>
             </w:pPr>
-            <w:proofErr w:type="spellStart"/>
             <w:r>
               <w:rPr>
                 <w:b/>
@@ -2853,7 +2766,6 @@
               </w:rPr>
               <w:t>N°</w:t>
             </w:r>
-            <w:proofErr w:type="spellEnd"/>
           </w:p>
         </w:tc>
         <w:tc>
@@ -2960,12 +2872,6 @@
         </w:tc>
       </w:tr>
       <w:tr>
-        <w:tblPrEx>
-          <w:tblCellMar>
-            <w:top w:w="0" w:type="dxa"/>
-            <w:bottom w:w="0" w:type="dxa"/>
-          </w:tblCellMar>
-        </w:tblPrEx>
         <w:trPr>
           <w:cantSplit/>
           <w:jc w:val="center"/>
@@ -3063,12 +2969,6 @@
         </w:tc>
       </w:tr>
       <w:tr>
-        <w:tblPrEx>
-          <w:tblCellMar>
-            <w:top w:w="0" w:type="dxa"/>
-            <w:bottom w:w="0" w:type="dxa"/>
-          </w:tblCellMar>
-        </w:tblPrEx>
         <w:trPr>
           <w:cantSplit/>
           <w:jc w:val="center"/>
@@ -3167,12 +3067,6 @@
         </w:tc>
       </w:tr>
       <w:tr>
-        <w:tblPrEx>
-          <w:tblCellMar>
-            <w:top w:w="0" w:type="dxa"/>
-            <w:bottom w:w="0" w:type="dxa"/>
-          </w:tblCellMar>
-        </w:tblPrEx>
         <w:trPr>
           <w:cantSplit/>
           <w:jc w:val="center"/>
@@ -3270,12 +3164,6 @@
         </w:tc>
       </w:tr>
       <w:tr>
-        <w:tblPrEx>
-          <w:tblCellMar>
-            <w:top w:w="0" w:type="dxa"/>
-            <w:bottom w:w="0" w:type="dxa"/>
-          </w:tblCellMar>
-        </w:tblPrEx>
         <w:trPr>
           <w:cantSplit/>
           <w:jc w:val="center"/>
@@ -3373,12 +3261,6 @@
         </w:tc>
       </w:tr>
       <w:tr>
-        <w:tblPrEx>
-          <w:tblCellMar>
-            <w:top w:w="0" w:type="dxa"/>
-            <w:bottom w:w="0" w:type="dxa"/>
-          </w:tblCellMar>
-        </w:tblPrEx>
         <w:trPr>
           <w:cantSplit/>
           <w:jc w:val="center"/>
@@ -3476,12 +3358,6 @@
         </w:tc>
       </w:tr>
       <w:tr>
-        <w:tblPrEx>
-          <w:tblCellMar>
-            <w:top w:w="0" w:type="dxa"/>
-            <w:bottom w:w="0" w:type="dxa"/>
-          </w:tblCellMar>
-        </w:tblPrEx>
         <w:trPr>
           <w:cantSplit/>
           <w:jc w:val="center"/>
@@ -3649,12 +3525,6 @@
         <w:gridCol w:w="6480"/>
       </w:tblGrid>
       <w:tr>
-        <w:tblPrEx>
-          <w:tblCellMar>
-            <w:top w:w="0" w:type="dxa"/>
-            <w:bottom w:w="0" w:type="dxa"/>
-          </w:tblCellMar>
-        </w:tblPrEx>
         <w:trPr>
           <w:tblHeader/>
           <w:jc w:val="center"/>
@@ -3729,12 +3599,6 @@
         </w:tc>
       </w:tr>
       <w:tr>
-        <w:tblPrEx>
-          <w:tblCellMar>
-            <w:top w:w="0" w:type="dxa"/>
-            <w:bottom w:w="0" w:type="dxa"/>
-          </w:tblCellMar>
-        </w:tblPrEx>
         <w:trPr>
           <w:cantSplit/>
           <w:jc w:val="center"/>
@@ -3801,12 +3665,6 @@
         </w:tc>
       </w:tr>
       <w:tr>
-        <w:tblPrEx>
-          <w:tblCellMar>
-            <w:top w:w="0" w:type="dxa"/>
-            <w:bottom w:w="0" w:type="dxa"/>
-          </w:tblCellMar>
-        </w:tblPrEx>
         <w:trPr>
           <w:cantSplit/>
           <w:jc w:val="center"/>
@@ -3873,12 +3731,6 @@
         </w:tc>
       </w:tr>
       <w:tr>
-        <w:tblPrEx>
-          <w:tblCellMar>
-            <w:top w:w="0" w:type="dxa"/>
-            <w:bottom w:w="0" w:type="dxa"/>
-          </w:tblCellMar>
-        </w:tblPrEx>
         <w:trPr>
           <w:cantSplit/>
           <w:jc w:val="center"/>
@@ -3945,12 +3797,6 @@
         </w:tc>
       </w:tr>
       <w:tr>
-        <w:tblPrEx>
-          <w:tblCellMar>
-            <w:top w:w="0" w:type="dxa"/>
-            <w:bottom w:w="0" w:type="dxa"/>
-          </w:tblCellMar>
-        </w:tblPrEx>
         <w:trPr>
           <w:cantSplit/>
           <w:jc w:val="center"/>
@@ -4017,12 +3863,6 @@
         </w:tc>
       </w:tr>
       <w:tr>
-        <w:tblPrEx>
-          <w:tblCellMar>
-            <w:top w:w="0" w:type="dxa"/>
-            <w:bottom w:w="0" w:type="dxa"/>
-          </w:tblCellMar>
-        </w:tblPrEx>
         <w:trPr>
           <w:cantSplit/>
           <w:jc w:val="center"/>
@@ -4115,12 +3955,6 @@
         <w:gridCol w:w="6480"/>
       </w:tblGrid>
       <w:tr>
-        <w:tblPrEx>
-          <w:tblCellMar>
-            <w:top w:w="0" w:type="dxa"/>
-            <w:bottom w:w="0" w:type="dxa"/>
-          </w:tblCellMar>
-        </w:tblPrEx>
         <w:trPr>
           <w:tblHeader/>
           <w:jc w:val="center"/>
@@ -4195,12 +4029,6 @@
         </w:tc>
       </w:tr>
       <w:tr>
-        <w:tblPrEx>
-          <w:tblCellMar>
-            <w:top w:w="0" w:type="dxa"/>
-            <w:bottom w:w="0" w:type="dxa"/>
-          </w:tblCellMar>
-        </w:tblPrEx>
         <w:trPr>
           <w:cantSplit/>
           <w:jc w:val="center"/>
@@ -4267,12 +4095,6 @@
         </w:tc>
       </w:tr>
       <w:tr>
-        <w:tblPrEx>
-          <w:tblCellMar>
-            <w:top w:w="0" w:type="dxa"/>
-            <w:bottom w:w="0" w:type="dxa"/>
-          </w:tblCellMar>
-        </w:tblPrEx>
         <w:trPr>
           <w:cantSplit/>
           <w:jc w:val="center"/>
@@ -4339,12 +4161,6 @@
         </w:tc>
       </w:tr>
       <w:tr>
-        <w:tblPrEx>
-          <w:tblCellMar>
-            <w:top w:w="0" w:type="dxa"/>
-            <w:bottom w:w="0" w:type="dxa"/>
-          </w:tblCellMar>
-        </w:tblPrEx>
         <w:trPr>
           <w:cantSplit/>
           <w:jc w:val="center"/>
@@ -4411,12 +4227,6 @@
         </w:tc>
       </w:tr>
       <w:tr>
-        <w:tblPrEx>
-          <w:tblCellMar>
-            <w:top w:w="0" w:type="dxa"/>
-            <w:bottom w:w="0" w:type="dxa"/>
-          </w:tblCellMar>
-        </w:tblPrEx>
         <w:trPr>
           <w:cantSplit/>
           <w:jc w:val="center"/>
@@ -4483,12 +4293,6 @@
         </w:tc>
       </w:tr>
       <w:tr>
-        <w:tblPrEx>
-          <w:tblCellMar>
-            <w:top w:w="0" w:type="dxa"/>
-            <w:bottom w:w="0" w:type="dxa"/>
-          </w:tblCellMar>
-        </w:tblPrEx>
         <w:trPr>
           <w:cantSplit/>
           <w:jc w:val="center"/>
@@ -4622,12 +4426,6 @@
         <w:gridCol w:w="1800"/>
       </w:tblGrid>
       <w:tr>
-        <w:tblPrEx>
-          <w:tblCellMar>
-            <w:top w:w="0" w:type="dxa"/>
-            <w:bottom w:w="0" w:type="dxa"/>
-          </w:tblCellMar>
-        </w:tblPrEx>
         <w:trPr>
           <w:tblHeader/>
           <w:jc w:val="center"/>
@@ -4654,7 +4452,6 @@
             <w:pPr>
               <w:jc w:val="center"/>
             </w:pPr>
-            <w:proofErr w:type="spellStart"/>
             <w:r>
               <w:rPr>
                 <w:b/>
@@ -4665,7 +4462,6 @@
               </w:rPr>
               <w:t>N°</w:t>
             </w:r>
-            <w:proofErr w:type="spellEnd"/>
           </w:p>
         </w:tc>
         <w:tc>
@@ -4806,12 +4602,6 @@
         </w:tc>
       </w:tr>
       <w:tr>
-        <w:tblPrEx>
-          <w:tblCellMar>
-            <w:top w:w="0" w:type="dxa"/>
-            <w:bottom w:w="0" w:type="dxa"/>
-          </w:tblCellMar>
-        </w:tblPrEx>
         <w:trPr>
           <w:cantSplit/>
           <w:jc w:val="center"/>
@@ -4965,12 +4755,6 @@
         </w:tc>
       </w:tr>
       <w:tr>
-        <w:tblPrEx>
-          <w:tblCellMar>
-            <w:top w:w="0" w:type="dxa"/>
-            <w:bottom w:w="0" w:type="dxa"/>
-          </w:tblCellMar>
-        </w:tblPrEx>
         <w:trPr>
           <w:cantSplit/>
           <w:jc w:val="center"/>
@@ -5119,12 +4903,6 @@
         </w:tc>
       </w:tr>
       <w:tr>
-        <w:tblPrEx>
-          <w:tblCellMar>
-            <w:top w:w="0" w:type="dxa"/>
-            <w:bottom w:w="0" w:type="dxa"/>
-          </w:tblCellMar>
-        </w:tblPrEx>
         <w:trPr>
           <w:cantSplit/>
           <w:jc w:val="center"/>
@@ -5278,12 +5056,6 @@
         </w:tc>
       </w:tr>
       <w:tr>
-        <w:tblPrEx>
-          <w:tblCellMar>
-            <w:top w:w="0" w:type="dxa"/>
-            <w:bottom w:w="0" w:type="dxa"/>
-          </w:tblCellMar>
-        </w:tblPrEx>
         <w:trPr>
           <w:cantSplit/>
           <w:jc w:val="center"/>
@@ -5432,12 +5204,6 @@
         </w:tc>
       </w:tr>
       <w:tr>
-        <w:tblPrEx>
-          <w:tblCellMar>
-            <w:top w:w="0" w:type="dxa"/>
-            <w:bottom w:w="0" w:type="dxa"/>
-          </w:tblCellMar>
-        </w:tblPrEx>
         <w:trPr>
           <w:cantSplit/>
           <w:jc w:val="center"/>
@@ -5591,12 +5357,6 @@
         </w:tc>
       </w:tr>
       <w:tr>
-        <w:tblPrEx>
-          <w:tblCellMar>
-            <w:top w:w="0" w:type="dxa"/>
-            <w:bottom w:w="0" w:type="dxa"/>
-          </w:tblCellMar>
-        </w:tblPrEx>
         <w:trPr>
           <w:cantSplit/>
           <w:jc w:val="center"/>
@@ -5745,12 +5505,6 @@
         </w:tc>
       </w:tr>
       <w:tr>
-        <w:tblPrEx>
-          <w:tblCellMar>
-            <w:top w:w="0" w:type="dxa"/>
-            <w:bottom w:w="0" w:type="dxa"/>
-          </w:tblCellMar>
-        </w:tblPrEx>
         <w:trPr>
           <w:cantSplit/>
           <w:jc w:val="center"/>
@@ -5904,12 +5658,6 @@
         </w:tc>
       </w:tr>
       <w:tr>
-        <w:tblPrEx>
-          <w:tblCellMar>
-            <w:top w:w="0" w:type="dxa"/>
-            <w:bottom w:w="0" w:type="dxa"/>
-          </w:tblCellMar>
-        </w:tblPrEx>
         <w:trPr>
           <w:cantSplit/>
           <w:jc w:val="center"/>
@@ -6058,12 +5806,6 @@
         </w:tc>
       </w:tr>
       <w:tr>
-        <w:tblPrEx>
-          <w:tblCellMar>
-            <w:top w:w="0" w:type="dxa"/>
-            <w:bottom w:w="0" w:type="dxa"/>
-          </w:tblCellMar>
-        </w:tblPrEx>
         <w:trPr>
           <w:cantSplit/>
           <w:jc w:val="center"/>
@@ -6217,12 +5959,6 @@
         </w:tc>
       </w:tr>
       <w:tr>
-        <w:tblPrEx>
-          <w:tblCellMar>
-            <w:top w:w="0" w:type="dxa"/>
-            <w:bottom w:w="0" w:type="dxa"/>
-          </w:tblCellMar>
-        </w:tblPrEx>
         <w:trPr>
           <w:cantSplit/>
           <w:jc w:val="center"/>
@@ -6371,12 +6107,6 @@
         </w:tc>
       </w:tr>
       <w:tr>
-        <w:tblPrEx>
-          <w:tblCellMar>
-            <w:top w:w="0" w:type="dxa"/>
-            <w:bottom w:w="0" w:type="dxa"/>
-          </w:tblCellMar>
-        </w:tblPrEx>
         <w:trPr>
           <w:cantSplit/>
           <w:jc w:val="center"/>
@@ -6530,12 +6260,6 @@
         </w:tc>
       </w:tr>
       <w:tr>
-        <w:tblPrEx>
-          <w:tblCellMar>
-            <w:top w:w="0" w:type="dxa"/>
-            <w:bottom w:w="0" w:type="dxa"/>
-          </w:tblCellMar>
-        </w:tblPrEx>
         <w:trPr>
           <w:cantSplit/>
           <w:jc w:val="center"/>
@@ -6684,12 +6408,6 @@
         </w:tc>
       </w:tr>
       <w:tr>
-        <w:tblPrEx>
-          <w:tblCellMar>
-            <w:top w:w="0" w:type="dxa"/>
-            <w:bottom w:w="0" w:type="dxa"/>
-          </w:tblCellMar>
-        </w:tblPrEx>
         <w:trPr>
           <w:cantSplit/>
           <w:jc w:val="center"/>
@@ -6843,12 +6561,6 @@
         </w:tc>
       </w:tr>
       <w:tr>
-        <w:tblPrEx>
-          <w:tblCellMar>
-            <w:top w:w="0" w:type="dxa"/>
-            <w:bottom w:w="0" w:type="dxa"/>
-          </w:tblCellMar>
-        </w:tblPrEx>
         <w:trPr>
           <w:cantSplit/>
           <w:jc w:val="center"/>
@@ -6997,12 +6709,6 @@
         </w:tc>
       </w:tr>
       <w:tr>
-        <w:tblPrEx>
-          <w:tblCellMar>
-            <w:top w:w="0" w:type="dxa"/>
-            <w:bottom w:w="0" w:type="dxa"/>
-          </w:tblCellMar>
-        </w:tblPrEx>
         <w:trPr>
           <w:cantSplit/>
           <w:jc w:val="center"/>
@@ -7156,12 +6862,6 @@
         </w:tc>
       </w:tr>
       <w:tr>
-        <w:tblPrEx>
-          <w:tblCellMar>
-            <w:top w:w="0" w:type="dxa"/>
-            <w:bottom w:w="0" w:type="dxa"/>
-          </w:tblCellMar>
-        </w:tblPrEx>
         <w:trPr>
           <w:cantSplit/>
           <w:jc w:val="center"/>
@@ -7310,12 +7010,6 @@
         </w:tc>
       </w:tr>
       <w:tr>
-        <w:tblPrEx>
-          <w:tblCellMar>
-            <w:top w:w="0" w:type="dxa"/>
-            <w:bottom w:w="0" w:type="dxa"/>
-          </w:tblCellMar>
-        </w:tblPrEx>
         <w:trPr>
           <w:cantSplit/>
           <w:jc w:val="center"/>
@@ -7469,12 +7163,6 @@
         </w:tc>
       </w:tr>
       <w:tr>
-        <w:tblPrEx>
-          <w:tblCellMar>
-            <w:top w:w="0" w:type="dxa"/>
-            <w:bottom w:w="0" w:type="dxa"/>
-          </w:tblCellMar>
-        </w:tblPrEx>
         <w:trPr>
           <w:cantSplit/>
           <w:jc w:val="center"/>
@@ -7623,12 +7311,6 @@
         </w:tc>
       </w:tr>
       <w:tr>
-        <w:tblPrEx>
-          <w:tblCellMar>
-            <w:top w:w="0" w:type="dxa"/>
-            <w:bottom w:w="0" w:type="dxa"/>
-          </w:tblCellMar>
-        </w:tblPrEx>
         <w:trPr>
           <w:cantSplit/>
           <w:jc w:val="center"/>
@@ -7782,12 +7464,6 @@
         </w:tc>
       </w:tr>
       <w:tr>
-        <w:tblPrEx>
-          <w:tblCellMar>
-            <w:top w:w="0" w:type="dxa"/>
-            <w:bottom w:w="0" w:type="dxa"/>
-          </w:tblCellMar>
-        </w:tblPrEx>
         <w:trPr>
           <w:cantSplit/>
           <w:jc w:val="center"/>
@@ -7936,12 +7612,6 @@
         </w:tc>
       </w:tr>
       <w:tr>
-        <w:tblPrEx>
-          <w:tblCellMar>
-            <w:top w:w="0" w:type="dxa"/>
-            <w:bottom w:w="0" w:type="dxa"/>
-          </w:tblCellMar>
-        </w:tblPrEx>
         <w:trPr>
           <w:cantSplit/>
           <w:jc w:val="center"/>
@@ -8095,12 +7765,6 @@
         </w:tc>
       </w:tr>
       <w:tr>
-        <w:tblPrEx>
-          <w:tblCellMar>
-            <w:top w:w="0" w:type="dxa"/>
-            <w:bottom w:w="0" w:type="dxa"/>
-          </w:tblCellMar>
-        </w:tblPrEx>
         <w:trPr>
           <w:cantSplit/>
           <w:jc w:val="center"/>
@@ -8249,12 +7913,6 @@
         </w:tc>
       </w:tr>
       <w:tr>
-        <w:tblPrEx>
-          <w:tblCellMar>
-            <w:top w:w="0" w:type="dxa"/>
-            <w:bottom w:w="0" w:type="dxa"/>
-          </w:tblCellMar>
-        </w:tblPrEx>
         <w:trPr>
           <w:cantSplit/>
           <w:jc w:val="center"/>
@@ -8409,12 +8067,6 @@
         </w:tc>
       </w:tr>
       <w:tr>
-        <w:tblPrEx>
-          <w:tblCellMar>
-            <w:top w:w="0" w:type="dxa"/>
-            <w:bottom w:w="0" w:type="dxa"/>
-          </w:tblCellMar>
-        </w:tblPrEx>
         <w:trPr>
           <w:cantSplit/>
           <w:jc w:val="center"/>
@@ -8563,12 +8215,6 @@
         </w:tc>
       </w:tr>
       <w:tr>
-        <w:tblPrEx>
-          <w:tblCellMar>
-            <w:top w:w="0" w:type="dxa"/>
-            <w:bottom w:w="0" w:type="dxa"/>
-          </w:tblCellMar>
-        </w:tblPrEx>
         <w:trPr>
           <w:cantSplit/>
           <w:jc w:val="center"/>
@@ -8722,12 +8368,6 @@
         </w:tc>
       </w:tr>
       <w:tr>
-        <w:tblPrEx>
-          <w:tblCellMar>
-            <w:top w:w="0" w:type="dxa"/>
-            <w:bottom w:w="0" w:type="dxa"/>
-          </w:tblCellMar>
-        </w:tblPrEx>
         <w:trPr>
           <w:cantSplit/>
           <w:jc w:val="center"/>
@@ -8876,12 +8516,6 @@
         </w:tc>
       </w:tr>
       <w:tr>
-        <w:tblPrEx>
-          <w:tblCellMar>
-            <w:top w:w="0" w:type="dxa"/>
-            <w:bottom w:w="0" w:type="dxa"/>
-          </w:tblCellMar>
-        </w:tblPrEx>
         <w:trPr>
           <w:cantSplit/>
           <w:jc w:val="center"/>
@@ -9035,12 +8669,6 @@
         </w:tc>
       </w:tr>
       <w:tr>
-        <w:tblPrEx>
-          <w:tblCellMar>
-            <w:top w:w="0" w:type="dxa"/>
-            <w:bottom w:w="0" w:type="dxa"/>
-          </w:tblCellMar>
-        </w:tblPrEx>
         <w:trPr>
           <w:cantSplit/>
           <w:jc w:val="center"/>
@@ -9189,12 +8817,6 @@
         </w:tc>
       </w:tr>
       <w:tr>
-        <w:tblPrEx>
-          <w:tblCellMar>
-            <w:top w:w="0" w:type="dxa"/>
-            <w:bottom w:w="0" w:type="dxa"/>
-          </w:tblCellMar>
-        </w:tblPrEx>
         <w:trPr>
           <w:cantSplit/>
           <w:jc w:val="center"/>
@@ -9348,12 +8970,6 @@
         </w:tc>
       </w:tr>
       <w:tr>
-        <w:tblPrEx>
-          <w:tblCellMar>
-            <w:top w:w="0" w:type="dxa"/>
-            <w:bottom w:w="0" w:type="dxa"/>
-          </w:tblCellMar>
-        </w:tblPrEx>
         <w:trPr>
           <w:cantSplit/>
           <w:jc w:val="center"/>
@@ -9545,12 +9161,6 @@
         <w:gridCol w:w="1680"/>
       </w:tblGrid>
       <w:tr>
-        <w:tblPrEx>
-          <w:tblCellMar>
-            <w:top w:w="0" w:type="dxa"/>
-            <w:bottom w:w="0" w:type="dxa"/>
-          </w:tblCellMar>
-        </w:tblPrEx>
         <w:trPr>
           <w:jc w:val="center"/>
         </w:trPr>
@@ -9760,12 +9370,6 @@
         </w:tc>
       </w:tr>
       <w:tr>
-        <w:tblPrEx>
-          <w:tblCellMar>
-            <w:top w:w="0" w:type="dxa"/>
-            <w:bottom w:w="0" w:type="dxa"/>
-          </w:tblCellMar>
-        </w:tblPrEx>
         <w:trPr>
           <w:jc w:val="center"/>
         </w:trPr>
@@ -9953,12 +9557,6 @@
         </w:tc>
       </w:tr>
       <w:tr>
-        <w:tblPrEx>
-          <w:tblCellMar>
-            <w:top w:w="0" w:type="dxa"/>
-            <w:bottom w:w="0" w:type="dxa"/>
-          </w:tblCellMar>
-        </w:tblPrEx>
         <w:trPr>
           <w:jc w:val="center"/>
         </w:trPr>
@@ -10146,12 +9744,6 @@
         </w:tc>
       </w:tr>
       <w:tr>
-        <w:tblPrEx>
-          <w:tblCellMar>
-            <w:top w:w="0" w:type="dxa"/>
-            <w:bottom w:w="0" w:type="dxa"/>
-          </w:tblCellMar>
-        </w:tblPrEx>
         <w:trPr>
           <w:jc w:val="center"/>
         </w:trPr>
@@ -10339,12 +9931,6 @@
         </w:tc>
       </w:tr>
       <w:tr>
-        <w:tblPrEx>
-          <w:tblCellMar>
-            <w:top w:w="0" w:type="dxa"/>
-            <w:bottom w:w="0" w:type="dxa"/>
-          </w:tblCellMar>
-        </w:tblPrEx>
         <w:trPr>
           <w:jc w:val="center"/>
         </w:trPr>
@@ -10602,23 +10188,7 @@
           <w:sz w:val="22"/>
           <w:szCs w:val="22"/>
         </w:rPr>
-        <w:t xml:space="preserve">Aplicar exactamente la misma prueba como pretest (antes de usar la aplicación) y como </w:t>
-      </w:r>
-      <w:proofErr w:type="spellStart"/>
-      <w:r>
-        <w:rPr>
-          <w:sz w:val="22"/>
-          <w:szCs w:val="22"/>
-        </w:rPr>
-        <w:t>postest</w:t>
-      </w:r>
-      <w:proofErr w:type="spellEnd"/>
-      <w:r>
-        <w:rPr>
-          <w:sz w:val="22"/>
-          <w:szCs w:val="22"/>
-        </w:rPr>
-        <w:t xml:space="preserve"> (después de terminar los módulos), para comparar el avance de cada estudiante.</w:t>
+        <w:t>Aplicar exactamente la misma prueba como pretest (antes de usar la aplicación) y como postest (después de terminar los módulos), para comparar el avance de cada estudiante.</w:t>
       </w:r>
     </w:p>
     <w:p>
@@ -10640,23 +10210,7 @@
           <w:sz w:val="22"/>
           <w:szCs w:val="22"/>
         </w:rPr>
-        <w:t xml:space="preserve">Se sugiere reportar el puntaje total y el </w:t>
-      </w:r>
-      <w:proofErr w:type="spellStart"/>
-      <w:r>
-        <w:rPr>
-          <w:sz w:val="22"/>
-          <w:szCs w:val="22"/>
-        </w:rPr>
-        <w:t>subpuntaje</w:t>
-      </w:r>
-      <w:proofErr w:type="spellEnd"/>
-      <w:r>
-        <w:rPr>
-          <w:sz w:val="22"/>
-          <w:szCs w:val="22"/>
-        </w:rPr>
-        <w:t xml:space="preserve"> por módulo: Aparato digestivo (14), La célula (14) y Alimentación saludable (2).</w:t>
+        <w:t>Se sugiere reportar el puntaje total y el subpuntaje por módulo: Aparato digestivo (14), La célula (14) y Alimentación saludable (2).</w:t>
       </w:r>
     </w:p>
     <w:p>
@@ -10682,7 +10236,7 @@
       </w:r>
     </w:p>
     <w:sectPr>
-      <w:footerReference w:type="default" r:id="rId12"/>
+      <w:footerReference w:type="default" r:id="rId13"/>
       <w:pgSz w:w="12240" w:h="15840"/>
       <w:pgMar w:top="1080" w:right="1080" w:bottom="1080" w:left="1080" w:header="708" w:footer="708" w:gutter="0"/>
       <w:cols w:space="720"/>

</xml_diff>